<commit_message>
feat: confirmation service improved, fix: notification mails sending
</commit_message>
<xml_diff>
--- a/events/confirmation_template/Teilnahmebescheinigung_2026.docx
+++ b/events/confirmation_template/Teilnahmebescheinigung_2026.docx
@@ -19,46 +19,6 @@
       <w:pPr>
         <w:pStyle w:val="berschrift2"/>
       </w:pPr>
-      <w:r>
-        <w:t>{</w:t>
-      </w:r>
-      <w:r>
-        <w:t>{</w:t>
-      </w:r>
-      <w:proofErr w:type="spellStart"/>
-      <w:r>
-        <w:t>academic</w:t>
-      </w:r>
-      <w:proofErr w:type="spellEnd"/>
-      <w:r>
-        <w:t>}}</w:t>
-      </w:r>
-      <w:r>
-        <w:t xml:space="preserve"> </w:t>
-      </w:r>
-      <w:r>
-        <w:t>{</w:t>
-      </w:r>
-      <w:r>
-        <w:t>{</w:t>
-      </w:r>
-      <w:proofErr w:type="spellStart"/>
-      <w:r>
-        <w:t>firstname</w:t>
-      </w:r>
-      <w:proofErr w:type="spellEnd"/>
-      <w:r>
-        <w:t>}} {{</w:t>
-      </w:r>
-      <w:proofErr w:type="spellStart"/>
-      <w:r>
-        <w:t>lastname</w:t>
-      </w:r>
-      <w:proofErr w:type="spellEnd"/>
-      <w:r>
-        <w:t>}}</w:t>
-      </w:r>
-      <w:proofErr w:type="spellStart"/>
     </w:p>
     <w:p/>
     <w:p>
@@ -66,34 +26,13 @@
         <w:spacing w:after="240"/>
       </w:pPr>
       <w:r>
-        <w:t>ha</w:t>
-      </w:r>
-      <w:proofErr w:type="spellEnd"/>
-      <w:r>
-        <w:t>t</w:t>
+        <w:t>hat</w:t>
       </w:r>
     </w:p>
     <w:p>
       <w:pPr>
         <w:spacing w:after="240"/>
       </w:pPr>
-      <w:r>
-        <w:t>{{</w:t>
-      </w:r>
-      <w:proofErr w:type="spellStart"/>
-      <w:r>
-        <w:t>event</w:t>
-      </w:r>
-      <w:r>
-        <w:t>_</w:t>
-      </w:r>
-      <w:r>
-        <w:t>date_string</w:t>
-      </w:r>
-      <w:proofErr w:type="spellEnd"/>
-      <w:r>
-        <w:t>}}</w:t>
-      </w:r>
     </w:p>
     <w:p>
       <w:pPr>
@@ -111,48 +50,11 @@
         <w:pStyle w:val="berschrift2"/>
         <w:spacing w:after="240"/>
       </w:pPr>
-      <w:r>
-        <w:t>{{</w:t>
-      </w:r>
-      <w:proofErr w:type="spellStart"/>
-      <w:r>
-        <w:t>event</w:t>
-      </w:r>
-      <w:r>
-        <w:t>_</w:t>
-      </w:r>
-      <w:r>
-        <w:t>name</w:t>
-      </w:r>
-      <w:proofErr w:type="spellEnd"/>
-      <w:r>
-        <w:t>}}</w:t>
-      </w:r>
     </w:p>
     <w:p>
       <w:pPr>
         <w:spacing w:after="240"/>
       </w:pPr>
-      <w:r>
-        <w:t xml:space="preserve">unter der Leitung von </w:t>
-      </w:r>
-      <w:r>
-        <w:rPr>
-          <w:highlight w:val="yellow"/>
-        </w:rPr>
-        <w:t>{{</w:t>
-      </w:r>
-      <w:proofErr w:type="spellStart"/>
-      <w:r>
-        <w:t>event_speaker_string</w:t>
-      </w:r>
-      <w:proofErr w:type="spellEnd"/>
-      <w:r>
-        <w:rPr>
-          <w:highlight w:val="yellow"/>
-        </w:rPr>
-        <w:t>}}</w:t>
-      </w:r>
     </w:p>
     <w:p>
       <w:pPr>
@@ -180,64 +82,69 @@
       <w:pPr>
         <w:ind w:left="360"/>
       </w:pPr>
-      <w:r>
-        <w:t>{{</w:t>
-      </w:r>
-      <w:proofErr w:type="spellStart"/>
-      <w:r>
-        <w:t>event_description</w:t>
-      </w:r>
-      <w:proofErr w:type="spellEnd"/>
-      <w:r>
-        <w:t>}}</w:t>
-      </w:r>
     </w:p>
     <w:p/>
     <w:p/>
+    <w:p/>
     <w:p>
-      <w:r>
-        <w:rPr>
-          <w:highlight w:val="yellow"/>
-        </w:rPr>
-        <w:t>{{</w:t>
-      </w:r>
-      <w:proofErr w:type="spellStart"/>
-      <w:r>
-        <w:rPr>
-          <w:highlight w:val="yellow"/>
-        </w:rPr>
-        <w:t>place</w:t>
-      </w:r>
-      <w:proofErr w:type="spellEnd"/>
-      <w:r>
-        <w:rPr>
-          <w:highlight w:val="yellow"/>
-        </w:rPr>
-        <w:t>}</w:t>
-      </w:r>
-      <w:r>
-        <w:rPr>
-          <w:highlight w:val="yellow"/>
-        </w:rPr>
-        <w:t>}</w:t>
-      </w:r>
-      <w:r>
-        <w:rPr>
-          <w:highlight w:val="yellow"/>
-        </w:rPr>
-        <w:t xml:space="preserve">, </w:t>
-      </w:r>
-      <w:r>
-        <w:t>{{</w:t>
-      </w:r>
-      <w:proofErr w:type="spellStart"/>
-      <w:r>
-        <w:t>today</w:t>
-      </w:r>
-      <w:proofErr w:type="spellEnd"/>
-      <w:r>
-        <w:t>}}</w:t>
-      </w:r>
+      <w:pPr>
+        <w:jc w:val="both"/>
+      </w:pPr>
+    </w:p>
+    <w:p>
+      <w:pPr>
+        <w:jc w:val="both"/>
+      </w:pPr>
+    </w:p>
+    <w:p>
+      <w:pPr>
+        <w:jc w:val="both"/>
+      </w:pPr>
+    </w:p>
+    <w:p>
+      <w:pPr>
+        <w:jc w:val="both"/>
+      </w:pPr>
+    </w:p>
+    <w:p>
+      <w:pPr>
+        <w:jc w:val="both"/>
+      </w:pPr>
+    </w:p>
+    <w:p>
+      <w:pPr>
+        <w:jc w:val="both"/>
+      </w:pPr>
+    </w:p>
+    <w:p>
+      <w:pPr>
+        <w:jc w:val="both"/>
+      </w:pPr>
+    </w:p>
+    <w:p>
+      <w:pPr>
+        <w:jc w:val="both"/>
+      </w:pPr>
+    </w:p>
+    <w:p>
+      <w:pPr>
+        <w:jc w:val="both"/>
+      </w:pPr>
+    </w:p>
+    <w:p>
+      <w:pPr>
+        <w:jc w:val="both"/>
+      </w:pPr>
+    </w:p>
+    <w:p>
+      <w:pPr>
+        <w:jc w:val="both"/>
+      </w:pPr>
+    </w:p>
+    <w:p>
+      <w:pPr>
+        <w:jc w:val="both"/>
+      </w:pPr>
     </w:p>
     <w:p>
       <w:pPr>
@@ -277,19 +184,7 @@
               <w:top w:val="single" w:sz="4" w:space="0" w:color="auto"/>
             </w:tcBorders>
           </w:tcPr>
-          <w:p>
-            <w:r>
-              <w:t>{{</w:t>
-            </w:r>
-            <w:proofErr w:type="spellStart"/>
-            <w:r>
-              <w:t>signatory_vfll</w:t>
-            </w:r>
-            <w:proofErr w:type="spellEnd"/>
-            <w:r>
-              <w:t>}}</w:t>
-            </w:r>
-          </w:p>
+          <w:p/>
         </w:tc>
         <w:tc>
           <w:tcPr>
@@ -304,22 +199,7 @@
               <w:top w:val="single" w:sz="4" w:space="0" w:color="auto"/>
             </w:tcBorders>
           </w:tcPr>
-          <w:p>
-            <w:r>
-              <w:t>{{</w:t>
-            </w:r>
-            <w:proofErr w:type="spellStart"/>
-            <w:r>
-              <w:t>signatory_</w:t>
-            </w:r>
-            <w:r>
-              <w:t>speaker</w:t>
-            </w:r>
-            <w:proofErr w:type="spellEnd"/>
-            <w:r>
-              <w:t>}}</w:t>
-            </w:r>
-          </w:p>
+          <w:p/>
         </w:tc>
       </w:tr>
       <w:tr>
@@ -361,11 +241,6 @@
         </w:tc>
       </w:tr>
     </w:tbl>
-    <w:p>
-      <w:pPr>
-        <w:jc w:val="both"/>
-      </w:pPr>
-    </w:p>
     <w:p>
       <w:pPr>
         <w:jc w:val="both"/>

</xml_diff>